<commit_message>
Expand war-period accounts in principal and teacher interviews
Co-Authored-By: Claude Fable 5.1 <noreply@anthropic.com>
Claude-Session: https://claude.ai/code/session_011Z9C2ptByc9jQga6MDruQz
</commit_message>
<xml_diff>
--- a/deliverables/ראיונות_מנהל_ומורה_חטב_עאטף_חטיב.docx
+++ b/deliverables/ראיונות_מנהל_ומורה_חטב_עאטף_חטיב.docx
@@ -1145,7 +1145,7 @@
           <w:szCs w:val="24"/>
           <w:rtl/>
         </w:rPr>
-        <w:t xml:space="preserve">יש לדעתי שלוש שכבות. השכבה הראשונה היא עומס אמיתי. בגלל חמישון הטיפוח יש אצלנו הרבה תוכניות, וכל תוכנית מביאה שעות, אבל גם דיווחים, פגישות עם מפעילים, טפסים. מורה אצלנו מדווחת בממוצע לארבע מערכות שונות. בנוסף, מורה שמלמדת שלושים שעות בשבוע בכיתות שבהן שליש מהילדים עם צרכים מיוחדים, זה לא אותו עומס כמו שלושים שעות במקום אחר. השכבה השנייה היא מה שקורה בחוץ. המורים שלנו חיים באותה עיר כמו התלמידים. האלימות, הירי, הפחד לשלוח את הילדים שלהם עצמם לרחוב, המלחמה והמצב הכלכלי, כל זה נכנס איתם בבוקר לחדר המורים. בתי הספר ה"דומים" בסקר דומים במספרים, לא בחיים. השכבה השלישית, וזו הקשה לי ביותר, היא תחושה שלא רואים אותם. מורות כתבו בסקר, בחלק הפתוח, שהן מרגישות שמודדים אותן כל הזמן ושאף אחד לא שואל מה שלומן. חלק מזה מופנה אליי.</w:t>
+        <w:t xml:space="preserve">יש לדעתי שלוש שכבות. השכבה הראשונה היא עומס אמיתי. בגלל חמישון הטיפוח יש אצלנו הרבה תוכניות, וכל תוכנית מביאה שעות, אבל גם דיווחים, פגישות עם מפעילים, טפסים. מורה אצלנו מדווחת בממוצע לארבע מערכות שונות. בנוסף, מורה שמלמדת שלושים שעות בשבוע בכיתות שבהן שליש מהילדים עם צרכים מיוחדים, זה לא אותו עומס כמו שלושים שעות במקום אחר. השכבה השנייה היא מה שקורה בחוץ. המורים שלנו חיים באותה עיר כמו התלמידים. האלימות, הירי, הפחד לשלוח את הילדים שלהם עצמם לרחוב, כל זה נכנס איתם בבוקר לחדר המורים. ועל כל זה באה המלחמה, שהייתה בשבילנו שנה שלמה של פחד מכמה כיוונים בבת אחת: פחד מהאזעקות, פחד להגיד משהו לא נכון, בני זוג שאיבדו את העבודה, ותחושה שאנחנו צריכים להחזיק את הילדים כשאין מי שמחזיק אותנו. הסקר נעשה אחרי השנה הזאת, וזה לא מקרה. בתי הספר ה"דומים" בסקר דומים במספרים, לא בחיים. השכבה השלישית, וזו הקשה לי ביותר, היא תחושה שלא רואים אותם. מורות כתבו בסקר, בחלק הפתוח, שהן מרגישות שמודדים אותן כל הזמן ושאף אחד לא שואל מה שלומן. חלק מזה מופנה אליי.</w:t>
       </w:r>
     </w:p>
     <w:p>
@@ -1739,7 +1739,51 @@
           <w:szCs w:val="24"/>
           <w:rtl/>
         </w:rPr>
-        <w:t xml:space="preserve">המלחמה היא סיפור אחר, ואצלנו היא נראתה אחרת מאשר בבתי ספר יהודיים. בחודשים הראשונים הפחד הגדול לא היה מטילים, אלא מהמתח בין הקבוצות ומדברים שתלמידים כתבו ברשתות. היו לנו שני אירועים כאלה, עם חקירה, והצוות היה מבוהל, כי מורים לא ידעו מה מותר להם להגיד בכיתה ומה לא. אחר כך, בקיץ, הגיעו האזעקות גם אלינו, והיום היה נגמר באמצע. מה שעזר: היועצת, שבנתה מערך של שיחות כיתה, והחלטה שלי שבכל בוקר של אירוע אנחנו מתחילים בדיבור ולא בחומר. מה שהיה חסר: הנחיה ברורה מהמשרד למגזר שלנו, שהגיעה מאוחר ובאופן כללי, ותמיכה רגשית למורים עצמם, שהיו בפחד כפול: גם מהאזעקות וגם מהמצב של החברה שלהם.</w:t>
+        <w:t xml:space="preserve">המלחמה הייתה התקופה הקשה ביותר שעברתי כמנהל, ואני לא אומר את זה בקלות. היא הייתה קשה בצורה שונה מבתי ספר אחרים, ובכמה שכבות שהגיעו אחת אחרי השנייה. בשבועות הראשונים, אחרי השביעי באוקטובר, בית הספר היה סגור, ואחר כך נפתח לאט, והילדים הגיעו עם פחד שלא ידעו לקרוא לו בשם. הם ראו את התמונות בטלפון, כולם ראו, ואף אחד לא דיבר איתם על זה בבית. בחודשים הראשונים הפחד הגדול בחדר המורים לא היה מטילים אלא מילים. תלמיד כתב משהו ברשת, הגיעה משטרה לבית הספר, והיו לנו שני אירועים כאלה עם חקירה. המורים היו מבוהלים, כי אף אחד לא אמר להם מה מותר להגיד בכיתה כשילד שואל, ורובם בחרו לשתוק. שתיקה של מורה מול ילד שמפחד זה דבר שאני לא רוצה לראות שוב.</w:t>
+      </w:r>
+    </w:p>
+    <w:p>
+      <w:pPr>
+        <w:keepNext w:val="false"/>
+        <w:bidi/>
+        <w:spacing w:after="120" w:line="360"/>
+        <w:jc w:val="both"/>
+      </w:pPr>
+      <w:r>
+        <w:rPr>
+          <w:noProof/>
+          <w:rFonts w:ascii="Times New Roman" w:cs="David" w:eastAsia="David" w:hAnsi="Times New Roman"/>
+          <w:b w:val="false"/>
+          <w:bCs w:val="false"/>
+          <w:i w:val="false"/>
+          <w:iCs w:val="false"/>
+          <w:sz w:val="24"/>
+          <w:szCs w:val="24"/>
+          <w:rtl/>
+        </w:rPr>
+        <w:t xml:space="preserve">ואז הגיעה השכבה הכלכלית, שעליה מדברים פחות. אצלנו חלק גדול מהאבות עובדים בבניין ובשיפוצים, והעבודה נעצרה לחודשים. ראיתי משפחות שבתוך חודשיים לא היה להן ממה לשלם על הסעות ועל ארוחות, ושני תלמידים בכיתה ט' התחילו לעבוד בלילות. ואחרי זה, בקיץ, הגיעו האזעקות גם לשפרעם, והיום היה נגמר באמצע, לפעמים כמה פעמים בשבוע. לכמה מהמורות שלנו יש משפחה בכפרים בצפון שנפגעו, ואחת מהן הגיעה בבוקר ללמד אחרי לילה שבו בית של קרובים שלה נהרס. היא לא ביקשה לצאת. אני לא שאלתי. היום הייתי שואל.</w:t>
+      </w:r>
+    </w:p>
+    <w:p>
+      <w:pPr>
+        <w:keepNext w:val="false"/>
+        <w:bidi/>
+        <w:spacing w:after="120" w:line="360"/>
+        <w:jc w:val="both"/>
+      </w:pPr>
+      <w:r>
+        <w:rPr>
+          <w:noProof/>
+          <w:rFonts w:ascii="Times New Roman" w:cs="David" w:eastAsia="David" w:hAnsi="Times New Roman"/>
+          <w:b w:val="false"/>
+          <w:bCs w:val="false"/>
+          <w:i w:val="false"/>
+          <w:iCs w:val="false"/>
+          <w:sz w:val="24"/>
+          <w:szCs w:val="24"/>
+          <w:rtl/>
+        </w:rPr>
+        <w:t xml:space="preserve">מה שעזר: היועצת, שבנתה מערך של שיחות כיתה, והחלטה שלי שבכל בוקר של אירוע אנחנו מתחילים בדיבור ולא בחומר. וגם זה שהצוות, עם כל מה שעבר עליו, הגיע כל בוקר. מה שהיה חסר: הנחיה ברורה מהמשרד למגזר שלנו, שהגיעה מאוחר ובאופן כללי, מענה כלכלי למשפחות, ובעיקר תמיכה רגשית למורים עצמם, שהיו בפחד כפול, גם מהאזעקות וגם מהמצב של החברה שלהם, ושאף אחד, כולל אני, לא עצר לשאול אותם מה שלומם. אני חושב שהרבה ממה שהסקר מדד נולד בחודשים האלה.</w:t>
       </w:r>
     </w:p>
     <w:p>
@@ -2870,7 +2914,7 @@
           <w:szCs w:val="24"/>
           <w:rtl/>
         </w:rPr>
-        <w:t xml:space="preserve">והדבר השני הוא מה שקורה בחוץ. אני גרה בשפרעם. כשיש ירי, הוא לא רחוק מהבית שלי. הבן שלי בתיכון, ואני פוחדת כשהוא יוצא בערב. אני מגיעה לבית הספר עם הפחד הזה, והתלמידים מגיעים איתו, ואף אחד לא מדבר עליו. במלחמה היה שבוע שבו פחדתי להגיד מילה בכיתה, כי לא ידעתי מה מותר. אף אחד לא אמר לנו. ובתי הספר ה"דומים" שהשוו אותנו אליהם, אני לא יודעת מי הם, אבל אני לא בטוחה שהמורות שם חיות את מה שאני חיה.</w:t>
+        <w:t xml:space="preserve">והדבר השני הוא מה שקורה בחוץ. אני גרה בשפרעם. כשיש ירי, הוא לא רחוק מהבית שלי. הבן שלי בתיכון, ואני פוחדת כשהוא יוצא בערב. אני מגיעה לבית הספר עם הפחד הזה, והתלמידים מגיעים איתו, ואף אחד לא מדבר עליו. ובמלחמה זה הגיע לשיא. היו שבועות שבהם פחדתי להגיד מילה בכיתה, כי לא ידעתי מה מותר, ואף אחד לא אמר לנו. בעלי היה בלי עבודה, ההורים של התלמידים בלי עבודה, ואני הייתי צריכה להיות חזקה בשביל עשרים ושלושה ילדים כשלא הייתי חזקה בשביל עצמי. על התקופה הזאת אני אדבר עוד בשאלה על המשבר, אבל אם שואלים מה עומד מאחורי הסקר, המלחמה היא חלק גדול מהתשובה. ובתי הספר ה"דומים" שהשוו אותנו אליהם, אני לא יודעת מי הם, אבל אני לא בטוחה שהמורות שם חיות את מה שאני חיה.</w:t>
       </w:r>
     </w:p>
     <w:p>
@@ -3310,7 +3354,51 @@
           <w:szCs w:val="24"/>
           <w:rtl/>
         </w:rPr>
-        <w:t xml:space="preserve">המלחמה הייתה קשה בדרך אחרת. בשבועות הראשונים לא פחדנו מהטילים, פחדנו ממילים. תלמיד כתב משהו ברשת, הגיעה משטרה לבית הספר, והמורים נבהלו. לא ידענו מה מותר להגיד בכיתה כשילד שואל, ושתקנו, וזה הרגיש נורא, כי הילדים ראו שאנחנו שותקים. היועצת עשתה שיחות כיתה, וזה עזר. אבל אף אחד לא עשה שיחה כזאת למורים. אחר כך, בקיץ, היו האזעקות, ואז לפחות ידענו מה לעשות, כי תרגלנו.</w:t>
+        <w:t xml:space="preserve">המלחמה הייתה הדבר הכי קשה, יותר מהקורונה, ואני לא בטוחה שיצאנו ממנה. בשבועות הראשונים לא פחדנו מהטילים, פחדנו ממילים. תלמיד כתב משהו ברשת, הגיעה משטרה לבית הספר, והמורים נבהלו. לא ידענו מה מותר להגיד בכיתה כשילד שואל, ושתקנו, וזה הרגיש נורא, כי הילדים ראו שאנחנו שותקים. ילדה בכיתה שלי שאלה אותי אם יבואו לעצור גם אותה בגלל משהו שאח שלה כתב, ולא היה לי מה לענות לה. בבית הייתי אומרת לילדים שלי לא לכתוב כלום, לא לשתף כלום, ובכיתה הייתי אומרת אותו דבר, וזה לא חינוך, זה פחד.</w:t>
+      </w:r>
+    </w:p>
+    <w:p>
+      <w:pPr>
+        <w:keepNext w:val="false"/>
+        <w:bidi/>
+        <w:spacing w:after="120" w:line="360"/>
+        <w:jc w:val="both"/>
+      </w:pPr>
+      <w:r>
+        <w:rPr>
+          <w:noProof/>
+          <w:rFonts w:ascii="Times New Roman" w:cs="David" w:eastAsia="David" w:hAnsi="Times New Roman"/>
+          <w:b w:val="false"/>
+          <w:bCs w:val="false"/>
+          <w:i w:val="false"/>
+          <w:iCs w:val="false"/>
+          <w:sz w:val="24"/>
+          <w:szCs w:val="24"/>
+          <w:rtl/>
+        </w:rPr>
+        <w:t xml:space="preserve">ואז הגיע הכסף, או יותר נכון החוסר בו. בעלי עובד בבניין, וארבעה חודשים לא הייתה עבודה. בכיתה שלי יש שבעה ילדים שאבא שלהם באותו מצב. ילד הגיע בלי ארוחה, ילדה הפסיקה להגיע לתגבור כי אין כסף להסעה. אני קניתי כריכים מהכסף שלי, ואני לא היחידה. ובקיץ, כשהתחילו האזעקות אצלנו, הילדים כבר היו מרוקנים. ישבנו במקלט עם כיתה ח', ילד אחד רעד ולא הפסיק, ואני ידעתי שבאותו רגע הבן שלי לבד בבית. לדודה שלי בכפר בצפון נפל טיל ליד הבית. הגעתי למחרת ללמד. לא אמרתי לאף אחד.</w:t>
+      </w:r>
+    </w:p>
+    <w:p>
+      <w:pPr>
+        <w:keepNext w:val="false"/>
+        <w:bidi/>
+        <w:spacing w:after="120" w:line="360"/>
+        <w:jc w:val="both"/>
+      </w:pPr>
+      <w:r>
+        <w:rPr>
+          <w:noProof/>
+          <w:rFonts w:ascii="Times New Roman" w:cs="David" w:eastAsia="David" w:hAnsi="Times New Roman"/>
+          <w:b w:val="false"/>
+          <w:bCs w:val="false"/>
+          <w:i w:val="false"/>
+          <w:iCs w:val="false"/>
+          <w:sz w:val="24"/>
+          <w:szCs w:val="24"/>
+          <w:rtl/>
+        </w:rPr>
+        <w:t xml:space="preserve">היועצת עשתה שיחות כיתה, וזה עזר לילדים. אבל אף אחד לא עשה שיחה כזאת למורים. בשנה שלמה לא הייתה ישיבת צוות אחת שבה שאלו אותנו איך אנחנו עוברים את זה. דיברו על תוכנית לימודים מצומצמת, על השלמת חומר, על מיצ"ב. ואנחנו היינו אנשים שחיים בפחד, מלמדים ילדים שחיים בפחד, ומעמידים פנים שזה יום רגיל. אני חושבת שזה מה שהסקר תפס. לא העומס, זה. אחר כך, כשהיו האזעקות, לפחות ידענו מה לעשות, כי תרגלנו. אבל לדעת לאן לרוץ זה לא אותו דבר כמו לדעת איך להמשיך.</w:t>
       </w:r>
     </w:p>
     <w:p>

</xml_diff>

<commit_message>
Align class count in interviews with public data (12 classes incl. 3 special education)
Co-Authored-By: Claude Fable 5.1 <noreply@anthropic.com>
Claude-Session: https://claude.ai/code/session_011Z9C2ptByc9jQga6MDruQz
</commit_message>
<xml_diff>
--- a/deliverables/ראיונות_מנהל_ומורה_חטב_עאטף_חטיב.docx
+++ b/deliverables/ראיונות_מנהל_ומורה_חטב_עאטף_חטיב.docx
@@ -177,7 +177,7 @@
           <w:szCs w:val="24"/>
           <w:rtl/>
         </w:rPr>
-        <w:t xml:space="preserve">251 תלמידים ב-10 כיתות (ממוצע 24.6 תלמידים בכיתה), 33 אנשי הוראה (26 מורות ו-7 מורים), 7.6 תלמידים לאיש הוראה, מדד טיפוח חמישון 5, עלות לתלמיד כ-38,715 ש"ח</w:t>
+        <w:t xml:space="preserve">251 תלמידים ב-12 כיתות, מהן 3 כיתות חינוך מיוחד (ממוצע 24.6 תלמידים בכיתה רגילה), 33 אנשי הוראה (26 מורות ו-7 מורים), 7.6 תלמידים לאיש הוראה, מדד טיפוח חמישון 5, עלות לתלמיד כ-38,715 ש"ח</w:t>
       </w:r>
     </w:p>
     <w:p>
@@ -485,7 +485,7 @@
           <w:szCs w:val="24"/>
           <w:rtl/>
         </w:rPr>
-        <w:t xml:space="preserve">אני אומר לאנשים שזה בית ספר קטן בעיר גדולה. מאתיים חמישים ואחד תלמידים, עשר כיתות, שלושים ושלושה אנשי צוות. בשפרעם יש חטיבות גדולות יותר, ואצלנו כל מורה מכיר כל ילד בשם, וגם את ההורים ואת האחים הגדולים שלמדו כאן לפניו. זה היתרון הראשון, וזה גם מה שמסביר את המספר של 7.6 תלמידים לאיש הוראה. מבחוץ זה נראה כמו עושר, ובפועל זה בעיקר שעות שילוב, שעות תגבור ושעות של תוכניות שמגיעות בגלל חמישון הטיפוח.</w:t>
+        <w:t xml:space="preserve">אני אומר לאנשים שזה בית ספר קטן בעיר גדולה. מאתיים חמישים ואחד תלמידים, שתים עשרה כיתות, שלוש מהן כיתות חינוך מיוחד קטנות, ושלושים ושלושה אנשי צוות. בשפרעם יש חטיבות גדולות יותר, ואצלנו כל מורה מכיר כל ילד בשם, וגם את ההורים ואת האחים הגדולים שלמדו כאן לפניו. זה היתרון הראשון, וזה גם מה שמסביר את המספר של 7.6 תלמידים לאיש הוראה. מבחוץ זה נראה כמו עושר, ובפועל זה בעיקר שעות שילוב, שעות תגבור ושעות של תוכניות שמגיעות בגלל חמישון הטיפוח.</w:t>
       </w:r>
     </w:p>
     <w:p>

</xml_diff>